<commit_message>
Fix 2 hallucinated references → verified PubMed citations
[8] Wang Z→Wang D: Recent advances in animal models, diagnosis, and treatment
    of TMJOA. Tissue Eng Part B Rev. 2023 (PMID 35994388)
    - Original was hallucinated (wrong journal, wrong title)
    - Found real paper: Wang D et al. with co-author Wang Z, explaining error

[22] Liu Y→Luo H: Biomedical data and computational models for drug
    repositioning. Brief Bioinform. 2021 (PMID 32043521)
    - Original 'Nat Methods 2022 perturbation' paper not found in PubMed/OpenAlex
    - Replaced with real drug repositioning evaluation methodology review

Verified: 41/41 references now all confirmed real PubMed publications
</commit_message>
<xml_diff>
--- a/02-gnn-drug-repositioning/data/paper_full_draft_v9.docx
+++ b/02-gnn-drug-repositioning/data/paper_full_draft_v9.docx
@@ -8200,7 +8200,7 @@
           <w:b w:val="0"/>
           <w:i w:val="0"/>
         </w:rPr>
-        <w:t xml:space="preserve"> Wang Z, et al. TMJ osteoarthritis: a review of current understanding and future directions. Int J Oral Sci. 2022;14(1):48.</w:t>
+        <w:t xml:space="preserve"> Wang D, et al. Recent advances in animal models, diagnosis, and treatment of temporomandibular joint osteoarthritis. Tissue Eng Part B Rev. 2023;29(1):68–82.</w:t>
       </w:r>
     </w:p>
     <w:p>
@@ -8536,7 +8536,7 @@
           <w:b w:val="0"/>
           <w:i w:val="0"/>
         </w:rPr>
-        <w:t xml:space="preserve"> Liu Y, et al. Learning interpretable cellular responses from perturbation data. Nat Methods. 2022;19(9):1093–1101.</w:t>
+        <w:t xml:space="preserve"> Luo H, et al. Biomedical data and computational models for drug repositioning: a comprehensive review. Brief Bioinform. 2021;22(2):1604–1619.</w:t>
       </w:r>
     </w:p>
     <w:p>

</xml_diff>